<commit_message>
parentsquare: Wayfinder résumé with the page's link; Hi, I'm Rahul in the headline
Co-Authored-By: Claude Opus 5.5 <noreply@anthropic.com>
Claude-Session: https://claude.ai/code/session_01VooCANpbXwi8kzU2UTzuUW
</commit_message>
<xml_diff>
--- a/parentsquare/resume.docx
+++ b/parentsquare/resume.docx
@@ -39,7 +39,6 @@
       <w:pPr>
         <w:pageBreakBefore w:val="0"/>
         <w:spacing w:after="0" w:before="0" w:line="240" w:lineRule="auto"/>
-        <w:ind w:left="0" w:firstLine="0"/>
         <w:jc w:val="center"/>
         <w:rPr>
           <w:rFonts w:ascii="Arial" w:cs="Arial" w:eastAsia="Arial" w:hAnsi="Arial"/>
@@ -140,7 +139,7 @@
           <w:iCs w:val="1"/>
           <w:rtl w:val="0"/>
         </w:rPr>
-        <w:t xml:space="preserve">Ed-tech product designer who makes complex school workflows simple and accessible.</w:t>
+        <w:t xml:space="preserve">K-12 product designer grounded in learning science, accessibility, and AI-assisted prototyping.</w:t>
       </w:r>
       <w:r>
         <w:rPr>
@@ -255,7 +254,7 @@
           <w:bCs w:val="0"/>
           <w:rtl w:val="0"/>
         </w:rPr>
-        <w:t xml:space="preserve">Built a Claude skill with Claude Code that finds where a learner is stuck through Socratic questioning and builds a lesson around it.</w:t>
+        <w:t xml:space="preserve">Built a Claude skill for building micro-courses that gates progression on demonstrated mastery, adapting scaffolding based on Socratic dialogue and misconception tracking.</w:t>
       </w:r>
       <w:r>
         <w:rPr>
@@ -329,6 +328,8 @@
           <w:rFonts w:ascii="Arial" w:cs="Arial" w:eastAsia="Arial" w:hAnsi="Arial"/>
         </w:rPr>
       </w:pPr>
+      <w:bookmarkStart w:colFirst="0" w:colLast="0" w:name="_heading=h.wkmug9xt76yu" w:id="5"/>
+      <w:bookmarkEnd w:id="5"/>
       <w:r>
         <w:rPr>
           <w:rFonts w:ascii="Arial" w:cs="Arial" w:eastAsia="Arial" w:hAnsi="Arial"/>
@@ -336,69 +337,7 @@
           <w:bCs w:val="0"/>
           <w:rtl w:val="0"/>
         </w:rPr>
-        <w:t xml:space="preserve">Rebuilt student onboarding from classroom research around where students got stuck; a doubled survey held completion near 84% in Encoura's first A/B test.</w:t>
-      </w:r>
-      <w:r>
-        <w:rPr>
-          <w:rtl w:val="0"/>
-        </w:rPr>
-      </w:r>
-    </w:p>
-    <w:p>
-      <w:pPr>
-        <w:pStyle w:val="Heading3"/>
-        <w:pageBreakBefore w:val="0"/>
-        <w:numPr>
-          <w:ilvl w:val="0"/>
-          <w:numId w:val="1"/>
-        </w:numPr>
-        <w:spacing w:after="200" w:before="100" w:line="240" w:lineRule="auto"/>
-        <w:ind w:left="540.0000000000001" w:hanging="359.9999999999999"/>
-        <w:rPr>
-          <w:rFonts w:ascii="Arial" w:cs="Arial" w:eastAsia="Arial" w:hAnsi="Arial"/>
-        </w:rPr>
-      </w:pPr>
-      <w:bookmarkStart w:colFirst="0" w:colLast="0" w:name="_heading=h.wkmug9xt76yu" w:id="5"/>
-      <w:bookmarkEnd w:id="5"/>
-      <w:r>
-        <w:rPr>
-          <w:rFonts w:ascii="Arial" w:cs="Arial" w:eastAsia="Arial" w:hAnsi="Arial"/>
-          <w:b w:val="0"/>
-          <w:bCs w:val="0"/>
-          <w:rtl w:val="0"/>
-        </w:rPr>
-        <w:t xml:space="preserve">Built the counselor workflow side of Encourage for Educators, including groups, status tracking and roster tools used to manage hundreds of students simultaneously.</w:t>
-      </w:r>
-      <w:r>
-        <w:rPr>
-          <w:rtl w:val="0"/>
-        </w:rPr>
-      </w:r>
-    </w:p>
-    <w:p>
-      <w:pPr>
-        <w:pStyle w:val="Heading3"/>
-        <w:numPr>
-          <w:ilvl w:val="0"/>
-          <w:numId w:val="1"/>
-        </w:numPr>
-        <w:spacing w:after="200" w:lineRule="auto"/>
-        <w:ind w:left="540.0000000000001" w:hanging="359.9999999999999"/>
-        <w:rPr>
-          <w:rFonts w:ascii="Arial" w:cs="Arial" w:eastAsia="Arial" w:hAnsi="Arial"/>
-        </w:rPr>
-      </w:pPr>
-      <w:bookmarkStart w:colFirst="0" w:colLast="0" w:name="_heading=h.j0ng1hyib37" w:id="8"/>
-      <w:bookmarkEnd w:id="8"/>
-      <w:r>
-        <w:rPr>
-          <w:rFonts w:ascii="Arial" w:cs="Arial" w:eastAsia="Arial" w:hAnsi="Arial"/>
-          <w:b w:val="0"/>
-          <w:bCs w:val="0"/>
-          <w:highlight w:val="white"/>
-          <w:rtl w:val="0"/>
-        </w:rPr>
-        <w:t xml:space="preserve">Led the migration of Encourage (150,000+ students) to React Native, redesigning layouts to hold up on school-issued devices and meet WCAG 2.1 AA.</w:t>
+        <w:t xml:space="preserve">Redesigned onboarding for a 2x longer intake survey maintaining completion rates using chunking and micro-interactions to cut cognitive load; built Encoura's first in-app A/B test.</w:t>
       </w:r>
       <w:r>
         <w:rPr>
@@ -420,8 +359,6 @@
           <w:rFonts w:ascii="Arial" w:cs="Arial" w:eastAsia="Arial" w:hAnsi="Arial"/>
         </w:rPr>
       </w:pPr>
-      <w:bookmarkStart w:colFirst="0" w:colLast="0" w:name="_heading=h.t43jb8u53wm1" w:id="6"/>
-      <w:bookmarkEnd w:id="6"/>
       <w:r>
         <w:rPr>
           <w:rFonts w:ascii="Arial" w:cs="Arial" w:eastAsia="Arial" w:hAnsi="Arial"/>
@@ -429,7 +366,7 @@
           <w:bCs w:val="0"/>
           <w:rtl w:val="0"/>
         </w:rPr>
-        <w:t xml:space="preserve">Own the Encourage Design System, keeping design and engineering on shared components, with every screen reviewed in Storybook and Chromatic.</w:t>
+        <w:t xml:space="preserve">Drive much of the team's product analytics and present findings at recurring Data Jams; first on the team to connect Pendo to Claude Code over MCP for AI-assisted analysis.</w:t>
       </w:r>
       <w:r>
         <w:rPr>
@@ -458,7 +395,69 @@
           <w:bCs w:val="0"/>
           <w:rtl w:val="0"/>
         </w:rPr>
-        <w:t xml:space="preserve">Pioneered AI prototyping at Encoura with Figma Make and Claude Code; drive much of the team's product analytics and first connected Pendo to Claude Code over MCP.</w:t>
+        <w:t xml:space="preserve">Pioneered AI prototyping at Encoura, using Figma Make and Claude Code to turn ideas into interactive proofs of concept.</w:t>
+      </w:r>
+      <w:r>
+        <w:rPr>
+          <w:rtl w:val="0"/>
+        </w:rPr>
+      </w:r>
+    </w:p>
+    <w:p>
+      <w:pPr>
+        <w:pStyle w:val="Heading3"/>
+        <w:pageBreakBefore w:val="0"/>
+        <w:numPr>
+          <w:ilvl w:val="0"/>
+          <w:numId w:val="1"/>
+        </w:numPr>
+        <w:spacing w:after="200" w:before="0" w:line="240" w:lineRule="auto"/>
+        <w:ind w:left="540.0000000000001" w:hanging="359.9999999999999"/>
+        <w:rPr>
+          <w:rFonts w:ascii="Arial" w:cs="Arial" w:eastAsia="Arial" w:hAnsi="Arial"/>
+        </w:rPr>
+      </w:pPr>
+      <w:bookmarkStart w:colFirst="0" w:colLast="0" w:name="_heading=h.t43jb8u53wm1" w:id="6"/>
+      <w:bookmarkEnd w:id="6"/>
+      <w:r>
+        <w:rPr>
+          <w:rFonts w:ascii="Arial" w:cs="Arial" w:eastAsia="Arial" w:hAnsi="Arial"/>
+          <w:b w:val="0"/>
+          <w:bCs w:val="0"/>
+          <w:rtl w:val="0"/>
+        </w:rPr>
+        <w:t xml:space="preserve">Led the migration of Encourage (150,000+ students) to React Native, redesigning layouts to hold up on school-issued devices and meet WCAG 2.1 AA.</w:t>
+      </w:r>
+      <w:r>
+        <w:rPr>
+          <w:rtl w:val="0"/>
+        </w:rPr>
+      </w:r>
+    </w:p>
+    <w:p>
+      <w:pPr>
+        <w:pStyle w:val="Heading3"/>
+        <w:numPr>
+          <w:ilvl w:val="0"/>
+          <w:numId w:val="1"/>
+        </w:numPr>
+        <w:spacing w:after="200" w:lineRule="auto"/>
+        <w:ind w:left="540.0000000000001" w:hanging="359.9999999999999"/>
+        <w:rPr>
+          <w:rFonts w:ascii="Arial" w:cs="Arial" w:eastAsia="Arial" w:hAnsi="Arial"/>
+        </w:rPr>
+      </w:pPr>
+      <w:bookmarkStart w:colFirst="0" w:colLast="0" w:name="_heading=h.j0ng1hyib37" w:id="8"/>
+      <w:bookmarkEnd w:id="8"/>
+      <w:r>
+        <w:rPr>
+          <w:rFonts w:ascii="Arial" w:cs="Arial" w:eastAsia="Arial" w:hAnsi="Arial"/>
+          <w:b w:val="0"/>
+          <w:bCs w:val="0"/>
+          <w:highlight w:val="white"/>
+          <w:rtl w:val="0"/>
+        </w:rPr>
+        <w:t xml:space="preserve">Built the counselor workflow side of Encourage for Educators, including student status tracking and roster tools used to manage hundreds of students simultaneously.</w:t>
       </w:r>
       <w:r>
         <w:rPr>
@@ -866,7 +865,7 @@
           <w:szCs w:val="22"/>
           <w:rtl w:val="0"/>
         </w:rPr>
-        <w:t xml:space="preserve">Interaction Design, Information Architecture, Prototyping, Design Systems</w:t>
+        <w:t xml:space="preserve">Information Architecture, Wireframing, Prototyping, Design Systems, UX Writing</w:t>
       </w:r>
     </w:p>
     <w:p>
@@ -887,16 +886,16 @@
           <w:szCs w:val="22"/>
           <w:rtl w:val="0"/>
         </w:rPr>
-        <w:t xml:space="preserve">Research: </w:t>
-      </w:r>
-      <w:r>
-        <w:rPr>
-          <w:rFonts w:ascii="Arial" w:cs="Arial" w:eastAsia="Arial" w:hAnsi="Arial"/>
-          <w:sz w:val="22"/>
-          <w:szCs w:val="22"/>
-          <w:rtl w:val="0"/>
-        </w:rPr>
-        <w:t xml:space="preserve">Usability Testing, A/B Testing, Interviews, Contextual Inquiry, Analytics</w:t>
+        <w:t xml:space="preserve">AI: </w:t>
+      </w:r>
+      <w:r>
+        <w:rPr>
+          <w:rFonts w:ascii="Arial" w:cs="Arial" w:eastAsia="Arial" w:hAnsi="Arial"/>
+          <w:sz w:val="22"/>
+          <w:szCs w:val="22"/>
+          <w:rtl w:val="0"/>
+        </w:rPr>
+        <w:t xml:space="preserve">Figma Make, Claude Code, MCP Integrations (Pendo), AI-Assisted Analysis &amp; Prototyping</w:t>
       </w:r>
     </w:p>
     <w:p>
@@ -917,16 +916,16 @@
           <w:szCs w:val="22"/>
           <w:rtl w:val="0"/>
         </w:rPr>
-        <w:t xml:space="preserve">Accessibility: </w:t>
-      </w:r>
-      <w:r>
-        <w:rPr>
-          <w:rFonts w:ascii="Arial" w:cs="Arial" w:eastAsia="Arial" w:hAnsi="Arial"/>
-          <w:sz w:val="22"/>
-          <w:szCs w:val="22"/>
-          <w:rtl w:val="0"/>
-        </w:rPr>
-        <w:t xml:space="preserve">WCAG 2.1 AA, CPACC (in progress), Keyboard &amp; Screen-Reader-Aware Design</w:t>
+        <w:t xml:space="preserve">Front-End: </w:t>
+      </w:r>
+      <w:r>
+        <w:rPr>
+          <w:rFonts w:ascii="Arial" w:cs="Arial" w:eastAsia="Arial" w:hAnsi="Arial"/>
+          <w:sz w:val="22"/>
+          <w:szCs w:val="22"/>
+          <w:rtl w:val="0"/>
+        </w:rPr>
+        <w:t xml:space="preserve">HTML, CSS, JavaScript, React Native</w:t>
       </w:r>
     </w:p>
     <w:p>
@@ -947,16 +946,16 @@
           <w:szCs w:val="22"/>
           <w:rtl w:val="0"/>
         </w:rPr>
-        <w:t xml:space="preserve">AI: </w:t>
-      </w:r>
-      <w:r>
-        <w:rPr>
-          <w:rFonts w:ascii="Arial" w:cs="Arial" w:eastAsia="Arial" w:hAnsi="Arial"/>
-          <w:sz w:val="22"/>
-          <w:szCs w:val="22"/>
-          <w:rtl w:val="0"/>
-        </w:rPr>
-        <w:t xml:space="preserve">Claude Code, Figma Make, MCP Integrations (Pendo), AI-Assisted Analysis &amp; Prototyping</w:t>
+        <w:t xml:space="preserve">Accessibility: </w:t>
+      </w:r>
+      <w:r>
+        <w:rPr>
+          <w:rFonts w:ascii="Arial" w:cs="Arial" w:eastAsia="Arial" w:hAnsi="Arial"/>
+          <w:sz w:val="22"/>
+          <w:szCs w:val="22"/>
+          <w:rtl w:val="0"/>
+        </w:rPr>
+        <w:t xml:space="preserve">WCAG 2.1 AA, CPACC (in progress), Keyboard &amp; Screen-Reader-Aware Design</w:t>
       </w:r>
     </w:p>
     <w:p>
@@ -977,16 +976,16 @@
           <w:szCs w:val="22"/>
           <w:rtl w:val="0"/>
         </w:rPr>
-        <w:t xml:space="preserve">Front-End: </w:t>
-      </w:r>
-      <w:r>
-        <w:rPr>
-          <w:rFonts w:ascii="Arial" w:cs="Arial" w:eastAsia="Arial" w:hAnsi="Arial"/>
-          <w:sz w:val="22"/>
-          <w:szCs w:val="22"/>
-          <w:rtl w:val="0"/>
-        </w:rPr>
-        <w:t xml:space="preserve">HTML, CSS, JavaScript, React Native</w:t>
+        <w:t xml:space="preserve">Learning Design: </w:t>
+      </w:r>
+      <w:r>
+        <w:rPr>
+          <w:rFonts w:ascii="Arial" w:cs="Arial" w:eastAsia="Arial" w:hAnsi="Arial"/>
+          <w:sz w:val="22"/>
+          <w:szCs w:val="22"/>
+          <w:rtl w:val="0"/>
+        </w:rPr>
+        <w:t xml:space="preserve">Self-Paced Instruction, ADDIE, Universal Design for Learning</w:t>
       </w:r>
     </w:p>
     <w:p>
@@ -1007,16 +1006,16 @@
           <w:szCs w:val="22"/>
           <w:rtl w:val="0"/>
         </w:rPr>
-        <w:t xml:space="preserve">Learning Design: </w:t>
-      </w:r>
-      <w:r>
-        <w:rPr>
-          <w:rFonts w:ascii="Arial" w:cs="Arial" w:eastAsia="Arial" w:hAnsi="Arial"/>
-          <w:sz w:val="22"/>
-          <w:szCs w:val="22"/>
-          <w:rtl w:val="0"/>
-        </w:rPr>
-        <w:t xml:space="preserve">Self-Paced Instruction, ADDIE, Universal Design for Learning</w:t>
+        <w:t xml:space="preserve">Research: </w:t>
+      </w:r>
+      <w:r>
+        <w:rPr>
+          <w:rFonts w:ascii="Arial" w:cs="Arial" w:eastAsia="Arial" w:hAnsi="Arial"/>
+          <w:sz w:val="22"/>
+          <w:szCs w:val="22"/>
+          <w:rtl w:val="0"/>
+        </w:rPr>
+        <w:t xml:space="preserve">Research Plans, Analytics, A/B &amp; Usability Testing, Interviews, Surveys</w:t>
       </w:r>
     </w:p>
     <w:p>

</xml_diff>